<commit_message>
fix(docs): redact JWT fragment flagged by gitleaks
The evidence doc showed a truncated but real JWT header fragment in
a Set-Cookie example. Gitleaks flagged it as a potential secret.
Replaced with a clear placeholder in both the markdown and the
regenerated .docx.
</commit_message>
<xml_diff>
--- a/docs/evidencias-practicas-logs.docx
+++ b/docs/evidencias-practicas-logs.docx
@@ -530,7 +530,7 @@
                 <w:rFonts w:ascii="Consolas" w:hAnsi="Consolas"/>
                 <w:sz w:val="17"/>
               </w:rPr>
-              <w:t>Set-Cookie: token=eyJhbGciOiJIUzI1NiIs...; Max-Age=7200; Path=/; HttpOnly; SameSite=Lax</w:t>
+              <w:t>Set-Cookie: token=&lt;JWT-omitido-por-seguridad&gt;; Max-Age=7200; Path=/; HttpOnly; SameSite=Lax</w:t>
             </w:r>
           </w:p>
           <w:p>
@@ -1438,7 +1438,7 @@
           </w:tcPr>
           <w:p>
             <w:r>
-              <w:t>Cookie: token=eyJhbGci... visible en el log de cada request</w:t>
+              <w:t>Cookie: token=&lt;JWT-omitido&gt; visible en el log de cada request</w:t>
             </w:r>
           </w:p>
         </w:tc>

</xml_diff>